<commit_message>
Round8 CP4 final manuscript PDF and consistency QA
</commit_message>
<xml_diff>
--- a/11_delivery/round8/F_final_manuscript.docx
+++ b/11_delivery/round8/F_final_manuscript.docx
@@ -746,9 +746,6 @@
           <w:footerReference w:type="default" r:id="rId6"/>
           <w:footerReference w:type="first" r:id="rId7"/>
           <w:footerReference w:type="even" r:id="rId12"/>
-          <w:headerReference w:type="default" r:id="rId13"/>
-          <w:headerReference w:type="first" r:id="rId14"/>
-          <w:headerReference w:type="even" r:id="rId15"/>
           <w:type w:val="nextPage"/>
           <w:pgSz w:w="11906" w:h="16838"/>
           <w:pgMar w:left="1276" w:right="1274" w:gutter="0" w:header="0" w:top="1702" w:footer="992" w:bottom="1048"/>
@@ -3637,15 +3634,6 @@
     </w:p>
     <w:p>
       <w:pPr>
-        <w:pStyle w:val="PaperBody"/>
-        <w:widowControl/>
-      </w:pPr>
-      <w:r>
-        <w:t>语料总体画像可按实际文本数对领域均值加权；若应用要求领域等权，则另报等权平均，不能把两种权重混称同一语料质量。抽样集与扩展集比较时先剔除重复 ID。图1给出五维域画像。A1 中 arxiv 的五项平均相对分位约为 0.840、0.752、0.690、0.865、0.807，非重叠扩展约为 0.834、0.748、0.682、0.864、0.806；github 的抽样与扩展画像也接近。这支持该标注体系内的描述复现，不能据此推出独立训练干预效果。</w:t>
-      </w:r>
-    </w:p>
-    <w:p>
-      <w:pPr>
         <w:pStyle w:val="PaperCaption"/>
         <w:keepNext/>
         <w:widowControl/>
@@ -3666,7 +3654,7 @@
                     <pic:cNvPicPr/>
                   </pic:nvPicPr>
                   <pic:blipFill>
-                    <a:blip r:embed="rId18"/>
+                    <a:blip r:embed="rId13"/>
                     <a:stretch>
                       <a:fillRect/>
                     </a:stretch>
@@ -3692,6 +3680,15 @@
       </w:pPr>
       <w:r>
         <w:t>图1 五维质量在抽样及扩展领域中的描述画像。横向比较依赖相同参考分布，不能解释为真实训练收益排序。</w:t>
+      </w:r>
+    </w:p>
+    <w:p>
+      <w:pPr>
+        <w:pStyle w:val="PaperBody"/>
+        <w:widowControl/>
+      </w:pPr>
+      <w:r>
+        <w:t>语料总体画像可按实际文本数对领域均值加权；若应用要求领域等权，则另报等权平均，不能把两种权重混称同一语料质量。抽样集与扩展集比较时先剔除重复 ID。图1给出五维域画像。A1 中 arxiv 的五项平均相对分位约为 0.840、0.752、0.690、0.865、0.807，非重叠扩展约为 0.834、0.748、0.682、0.864、0.806；github 的抽样与扩展画像也接近。这支持该标注体系内的描述复现，不能据此推出独立训练干预效果。</w:t>
       </w:r>
     </w:p>
     <w:p>
@@ -5030,7 +5027,7 @@
       <w:r>
         <w:drawing>
           <wp:inline xmlns:a="http://schemas.openxmlformats.org/drawingml/2006/main">
-            <wp:extent cx="4608000" cy="4063271"/>
+            <wp:extent cx="4320000" cy="3809317"/>
             <wp:docPr id="6" name="Picture 6"/>
             <wp:cNvGraphicFramePr>
               <a:graphicFrameLocks noChangeAspect="1"/>
@@ -5043,7 +5040,7 @@
                     <pic:cNvPicPr/>
                   </pic:nvPicPr>
                   <pic:blipFill>
-                    <a:blip r:embed="rId19"/>
+                    <a:blip r:embed="rId14"/>
                     <a:stretch>
                       <a:fillRect/>
                     </a:stretch>
@@ -5051,7 +5048,7 @@
                   <pic:spPr>
                     <a:xfrm>
                       <a:off x="0" y="0"/>
-                      <a:ext cx="4608000" cy="4063271"/>
+                      <a:ext cx="4320000" cy="3809317"/>
                     </a:xfrm>
                     <a:prstGeom prst="rect"/>
                   </pic:spPr>
@@ -6789,7 +6786,7 @@
                     <pic:cNvPicPr/>
                   </pic:nvPicPr>
                   <pic:blipFill>
-                    <a:blip r:embed="rId20"/>
+                    <a:blip r:embed="rId15"/>
                     <a:stretch>
                       <a:fillRect/>
                     </a:stretch>
@@ -7261,7 +7258,7 @@
       <w:r>
         <w:drawing>
           <wp:inline xmlns:a="http://schemas.openxmlformats.org/drawingml/2006/main">
-            <wp:extent cx="4608000" cy="4310710"/>
+            <wp:extent cx="4320000" cy="4041290"/>
             <wp:docPr id="8" name="Picture 8"/>
             <wp:cNvGraphicFramePr>
               <a:graphicFrameLocks noChangeAspect="1"/>
@@ -7274,7 +7271,7 @@
                     <pic:cNvPicPr/>
                   </pic:nvPicPr>
                   <pic:blipFill>
-                    <a:blip r:embed="rId21"/>
+                    <a:blip r:embed="rId17"/>
                     <a:stretch>
                       <a:fillRect/>
                     </a:stretch>
@@ -7282,7 +7279,7 @@
                   <pic:spPr>
                     <a:xfrm>
                       <a:off x="0" y="0"/>
-                      <a:ext cx="4608000" cy="4310710"/>
+                      <a:ext cx="4320000" cy="4041290"/>
                     </a:xfrm>
                     <a:prstGeom prst="rect"/>
                   </pic:spPr>
@@ -9733,7 +9730,7 @@
       <w:r>
         <w:drawing>
           <wp:inline xmlns:a="http://schemas.openxmlformats.org/drawingml/2006/main">
-            <wp:extent cx="4608000" cy="4087742"/>
+            <wp:extent cx="4320000" cy="3832258"/>
             <wp:docPr id="9" name="Picture 9"/>
             <wp:cNvGraphicFramePr>
               <a:graphicFrameLocks noChangeAspect="1"/>
@@ -9746,7 +9743,7 @@
                     <pic:cNvPicPr/>
                   </pic:nvPicPr>
                   <pic:blipFill>
-                    <a:blip r:embed="rId22"/>
+                    <a:blip r:embed="rId18"/>
                     <a:stretch>
                       <a:fillRect/>
                     </a:stretch>
@@ -9754,7 +9751,7 @@
                   <pic:spPr>
                     <a:xfrm>
                       <a:off x="0" y="0"/>
-                      <a:ext cx="4608000" cy="4087742"/>
+                      <a:ext cx="4320000" cy="3832258"/>
                     </a:xfrm>
                     <a:prstGeom prst="rect"/>
                   </pic:spPr>
@@ -9878,15 +9875,6 @@
       </w:pPr>
       <w:r>
         <w:t>左侧负项随 N 增大而趋近零，正项严格递增，故固定 Q 只有一个内点解或边界解。外层质量问题可能非凸：先检查端点和 101 个固定网格点的所有局部谷，再作区间精化，并以 201 点加密及每情景三个 SLSQP 初值核对。</w:t>
-      </w:r>
-    </w:p>
-    <w:p>
-      <w:pPr>
-        <w:pStyle w:val="PaperBody"/>
-        <w:widowControl/>
-      </w:pPr>
-      <w:r>
-        <w:t>表8对比 10¹⁹ 预算、2048 上下文和参考收益 h_Q=0.361995 下的结果。图6展示完整条件投入路径。成本形式改变机会成本，因而即使采用相同收益假设，也可能给出几乎不投入、中等投入或直接投向上界的不同质量选择。</w:t>
       </w:r>
     </w:p>
     <w:p>
@@ -10559,7 +10547,7 @@
       <w:r>
         <w:drawing>
           <wp:inline xmlns:a="http://schemas.openxmlformats.org/drawingml/2006/main">
-            <wp:extent cx="4608000" cy="4087742"/>
+            <wp:extent cx="4320000" cy="3832258"/>
             <wp:docPr id="10" name="Picture 10"/>
             <wp:cNvGraphicFramePr>
               <a:graphicFrameLocks noChangeAspect="1"/>
@@ -10572,7 +10560,7 @@
                     <pic:cNvPicPr/>
                   </pic:nvPicPr>
                   <pic:blipFill>
-                    <a:blip r:embed="rId23"/>
+                    <a:blip r:embed="rId19"/>
                     <a:stretch>
                       <a:fillRect/>
                     </a:stretch>
@@ -10580,7 +10568,7 @@
                   <pic:spPr>
                     <a:xfrm>
                       <a:off x="0" y="0"/>
-                      <a:ext cx="4608000" cy="4087742"/>
+                      <a:ext cx="4320000" cy="3832258"/>
                     </a:xfrm>
                     <a:prstGeom prst="rect"/>
                   </pic:spPr>
@@ -10598,6 +10586,15 @@
       </w:pPr>
       <w:r>
         <w:t>图6 不同质量成本下的条件配置路径。收益假设来自半合成质量校准，曲线不是实测投资回报。</w:t>
+      </w:r>
+    </w:p>
+    <w:p>
+      <w:pPr>
+        <w:pStyle w:val="PaperBody"/>
+        <w:widowControl/>
+      </w:pPr>
+      <w:r>
+        <w:t>表8对比 10¹⁹ 预算、2048 上下文和参考收益 h_Q=0.361995 下的结果。图6展示完整条件投入路径。成本形式改变机会成本，因而即使采用相同收益假设，也可能给出几乎不投入、中等投入或直接投向上界的不同质量选择。</w:t>
       </w:r>
     </w:p>
     <w:p>
@@ -10953,15 +10950,6 @@
     </w:p>
     <w:p>
       <w:pPr>
-        <w:pStyle w:val="PaperBody"/>
-        <w:widowControl/>
-      </w:pPr>
-      <w:r>
-        <w:t>保留 Q2 的 200 个联合五参数向量，以五档上下文和 51 个预算传播，共得到 51000 个条件配置。没有把各参数的边际区间独立组合。图7分开显示参数数值敏感性和收益机制情景范围。例如参考低预算的参数条件区间约为 N∈[0.221249,0.221387]、D∈[7.047196,7.051612]、Loss∈[2.998852,2.998986]；很窄是附件规则曲面的结果。质量、成本和配比情景包络不具有抽样置信区间含义，两类范围均不覆盖全部来源与模型错误。</w:t>
-      </w:r>
-    </w:p>
-    <w:p>
-      <w:pPr>
         <w:pStyle w:val="PaperCaption"/>
         <w:keepNext/>
         <w:widowControl/>
@@ -10969,7 +10957,7 @@
       <w:r>
         <w:drawing>
           <wp:inline xmlns:a="http://schemas.openxmlformats.org/drawingml/2006/main">
-            <wp:extent cx="4608000" cy="4087742"/>
+            <wp:extent cx="4320000" cy="3832258"/>
             <wp:docPr id="11" name="Picture 11"/>
             <wp:cNvGraphicFramePr>
               <a:graphicFrameLocks noChangeAspect="1"/>
@@ -10982,7 +10970,7 @@
                     <pic:cNvPicPr/>
                   </pic:nvPicPr>
                   <pic:blipFill>
-                    <a:blip r:embed="rId24"/>
+                    <a:blip r:embed="rId20"/>
                     <a:stretch>
                       <a:fillRect/>
                     </a:stretch>
@@ -10990,7 +10978,7 @@
                   <pic:spPr>
                     <a:xfrm>
                       <a:off x="0" y="0"/>
-                      <a:ext cx="4608000" cy="4087742"/>
+                      <a:ext cx="4320000" cy="3832258"/>
                     </a:xfrm>
                     <a:prstGeom prst="rect"/>
                   </pic:spPr>
@@ -11008,6 +10996,15 @@
       </w:pPr>
       <w:r>
         <w:t>图7 联合参数传播与机制情景范围。参数条件分位和情景包络分别解释，不把两者合称95%置信区间。</w:t>
+      </w:r>
+    </w:p>
+    <w:p>
+      <w:pPr>
+        <w:pStyle w:val="PaperBody"/>
+        <w:widowControl/>
+      </w:pPr>
+      <w:r>
+        <w:t>保留 Q2 的 200 个联合五参数向量，以五档上下文和 51 个预算传播，共得到 51000 个条件配置。没有把各参数的边际区间独立组合。图7分开显示参数数值敏感性和收益机制情景范围。例如参考低预算的参数条件区间约为 N∈[0.221249,0.221387]、D∈[7.047196,7.051612]、Loss∈[2.998852,2.998986]；很窄是附件规则曲面的结果。质量、成本和配比情景包络不具有抽样置信区间含义，两类范围均不覆盖全部来源与模型错误。</w:t>
       </w:r>
     </w:p>
     <w:p>
@@ -11931,7 +11928,7 @@
                     <pic:cNvPicPr/>
                   </pic:nvPicPr>
                   <pic:blipFill>
-                    <a:blip r:embed="rId25"/>
+                    <a:blip r:embed="rId21"/>
                     <a:stretch>
                       <a:fillRect/>
                     </a:stretch>
@@ -13916,7 +13913,7 @@
                     <pic:cNvPicPr/>
                   </pic:nvPicPr>
                   <pic:blipFill>
-                    <a:blip r:embed="rId26"/>
+                    <a:blip r:embed="rId22"/>
                     <a:stretch>
                       <a:fillRect/>
                     </a:stretch>
@@ -18147,7 +18144,6 @@
     </w:p>
     <w:sectPr>
       <w:footerReference w:type="default" r:id="rId16"/>
-      <w:headerReference w:type="default" r:id="rId17"/>
       <w:pgSz w:w="11906" w:h="16838"/>
       <w:pgMar w:left="1276" w:right="1274" w:gutter="0" w:header="0" w:top="1702" w:footer="992" w:bottom="1048"/>
       <w:formProt w:val="false"/>
@@ -18182,22 +18178,6 @@
     <w:fldSimple w:instr="PAGE"/>
   </w:p>
 </w:ftr>
-</file>
-
-<file path=word/header1.xml><?xml version="1.0" encoding="utf-8"?>
-<w:hdr xmlns:m="http://schemas.openxmlformats.org/officeDocument/2006/math" xmlns:mc="http://schemas.openxmlformats.org/markup-compatibility/2006" xmlns:mo="http://schemas.microsoft.com/office/mac/office/2008/main" xmlns:mv="urn:schemas-microsoft-com:mac:vml" xmlns:o="urn:schemas-microsoft-com:office:office" xmlns:r="http://schemas.openxmlformats.org/officeDocument/2006/relationships" xmlns:v="urn:schemas-microsoft-com:vml" xmlns:w10="urn:schemas-microsoft-com:office:word" xmlns:w14="http://schemas.microsoft.com/office/word/2010/wordml" xmlns:w="http://schemas.openxmlformats.org/wordprocessingml/2006/main" xmlns:wne="http://schemas.microsoft.com/office/word/2006/wordml" xmlns:wp14="http://schemas.microsoft.com/office/word/2010/wordprocessingDrawing" xmlns:wp="http://schemas.openxmlformats.org/drawingml/2006/wordprocessingDrawing" xmlns:wpc="http://schemas.microsoft.com/office/word/2010/wordprocessingCanvas" xmlns:wpg="http://schemas.microsoft.com/office/word/2010/wordprocessingGroup" xmlns:wpi="http://schemas.microsoft.com/office/word/2010/wordprocessingInk" xmlns:wps="http://schemas.microsoft.com/office/word/2010/wordprocessingShape" mc:Ignorable="w14 wp14"/>
-</file>
-
-<file path=word/header2.xml><?xml version="1.0" encoding="utf-8"?>
-<w:hdr xmlns:m="http://schemas.openxmlformats.org/officeDocument/2006/math" xmlns:mc="http://schemas.openxmlformats.org/markup-compatibility/2006" xmlns:mo="http://schemas.microsoft.com/office/mac/office/2008/main" xmlns:mv="urn:schemas-microsoft-com:mac:vml" xmlns:o="urn:schemas-microsoft-com:office:office" xmlns:r="http://schemas.openxmlformats.org/officeDocument/2006/relationships" xmlns:v="urn:schemas-microsoft-com:vml" xmlns:w10="urn:schemas-microsoft-com:office:word" xmlns:w14="http://schemas.microsoft.com/office/word/2010/wordml" xmlns:w="http://schemas.openxmlformats.org/wordprocessingml/2006/main" xmlns:wne="http://schemas.microsoft.com/office/word/2006/wordml" xmlns:wp14="http://schemas.microsoft.com/office/word/2010/wordprocessingDrawing" xmlns:wp="http://schemas.openxmlformats.org/drawingml/2006/wordprocessingDrawing" xmlns:wpc="http://schemas.microsoft.com/office/word/2010/wordprocessingCanvas" xmlns:wpg="http://schemas.microsoft.com/office/word/2010/wordprocessingGroup" xmlns:wpi="http://schemas.microsoft.com/office/word/2010/wordprocessingInk" xmlns:wps="http://schemas.microsoft.com/office/word/2010/wordprocessingShape" mc:Ignorable="w14 wp14"/>
-</file>
-
-<file path=word/header3.xml><?xml version="1.0" encoding="utf-8"?>
-<w:hdr xmlns:m="http://schemas.openxmlformats.org/officeDocument/2006/math" xmlns:mc="http://schemas.openxmlformats.org/markup-compatibility/2006" xmlns:mo="http://schemas.microsoft.com/office/mac/office/2008/main" xmlns:mv="urn:schemas-microsoft-com:mac:vml" xmlns:o="urn:schemas-microsoft-com:office:office" xmlns:r="http://schemas.openxmlformats.org/officeDocument/2006/relationships" xmlns:v="urn:schemas-microsoft-com:vml" xmlns:w10="urn:schemas-microsoft-com:office:word" xmlns:w14="http://schemas.microsoft.com/office/word/2010/wordml" xmlns:w="http://schemas.openxmlformats.org/wordprocessingml/2006/main" xmlns:wne="http://schemas.microsoft.com/office/word/2006/wordml" xmlns:wp14="http://schemas.microsoft.com/office/word/2010/wordprocessingDrawing" xmlns:wp="http://schemas.openxmlformats.org/drawingml/2006/wordprocessingDrawing" xmlns:wpc="http://schemas.microsoft.com/office/word/2010/wordprocessingCanvas" xmlns:wpg="http://schemas.microsoft.com/office/word/2010/wordprocessingGroup" xmlns:wpi="http://schemas.microsoft.com/office/word/2010/wordprocessingInk" xmlns:wps="http://schemas.microsoft.com/office/word/2010/wordprocessingShape" mc:Ignorable="w14 wp14"/>
-</file>
-
-<file path=word/header4.xml><?xml version="1.0" encoding="utf-8"?>
-<w:hdr xmlns:m="http://schemas.openxmlformats.org/officeDocument/2006/math" xmlns:mc="http://schemas.openxmlformats.org/markup-compatibility/2006" xmlns:mo="http://schemas.microsoft.com/office/mac/office/2008/main" xmlns:mv="urn:schemas-microsoft-com:mac:vml" xmlns:o="urn:schemas-microsoft-com:office:office" xmlns:r="http://schemas.openxmlformats.org/officeDocument/2006/relationships" xmlns:v="urn:schemas-microsoft-com:vml" xmlns:w10="urn:schemas-microsoft-com:office:word" xmlns:w14="http://schemas.microsoft.com/office/word/2010/wordml" xmlns:w="http://schemas.openxmlformats.org/wordprocessingml/2006/main" xmlns:wne="http://schemas.microsoft.com/office/word/2006/wordml" xmlns:wp14="http://schemas.microsoft.com/office/word/2010/wordprocessingDrawing" xmlns:wp="http://schemas.openxmlformats.org/drawingml/2006/wordprocessingDrawing" xmlns:wpc="http://schemas.microsoft.com/office/word/2010/wordprocessingCanvas" xmlns:wpg="http://schemas.microsoft.com/office/word/2010/wordprocessingGroup" xmlns:wpi="http://schemas.microsoft.com/office/word/2010/wordprocessingInk" xmlns:wps="http://schemas.microsoft.com/office/word/2010/wordprocessingShape" mc:Ignorable="w14 wp14"/>
 </file>
 
 <file path=word/numbering.xml><?xml version="1.0" encoding="utf-8"?>

</xml_diff>